<commit_message>
Word'de numarali madde girintisi ve devam-satiri bosluk hatasi
Render kontrolunde yakalandi: 'Competing interests' bolumunun uc numarali
maddesinde metnin ORTASINDA 4'luk bosluklar vardi ('were     run on
metered'). Sebep make_docx.js'in paragraf birlestiricisi: numarali madde
govdeleri kaynakta 3 boslukla girintili ve duz join 'kelime' + ' ' +
'   kelime' uretiyordu. Devam satirlarinin bastaki boslugu artik atiliyor
(21 satiri etkiliyordu).

Ayrica '1. ' ile baslayan paragraflar asili girinti aliyor, numara disarida
kaliyor -- madde olarak okunuyorlar artik.

Sarmali madde imi (-) icin ayni hata potansiyeli var (devam satiri ayri
paragrafa dusuyor) ama bu makalede sarmali madde imi YOK (0 sayildi), o
yuzden dokunulmadi.
</commit_message>
<xml_diff>
--- a/paper/paper.docx
+++ b/paper/paper.docx
@@ -145,6 +145,7 @@
     <w:p>
       <w:pPr>
         <w:spacing w:after="120" w:line="276"/>
+        <w:ind w:left="360" w:hanging="360"/>
         <w:jc w:val="both"/>
       </w:pPr>
       <w:r>
@@ -17917,6 +17918,7 @@
     <w:p>
       <w:pPr>
         <w:spacing w:after="120" w:line="276"/>
+        <w:ind w:left="360" w:hanging="360"/>
         <w:jc w:val="both"/>
       </w:pPr>
       <w:r>
@@ -17930,12 +17932,13 @@
         <w:t xml:space="preserve">Purchased services, not relationships.</w:t>
       </w:r>
       <w:r>
-        <w:t xml:space="preserve"> Two components of the experiment were    run on metered commercial APIs at published list prices: generation of the    external-laundering attack corpus through Anthropic's API (measured cost USD    17.704, Section 3.2) and one of the two meaning-preservation judges (measured cost    USD 7.021 for the Claude Opus 5 judge, Section 3.5). The second judge,    gpt-oss-120b, was served through Groq and its cost was not separately metered.    These are arm's-length purchases of a metered service, reported in the paper as    measurements of attack economics because attack cost is part of the threat model.    They establish no relationship with the vendors beyond that of a paying customer,    and no vendor reviewed, funded, approved or was consulted about this work.</w:t>
+        <w:t xml:space="preserve"> Two components of the experiment were run on metered commercial APIs at published list prices: generation of the external-laundering attack corpus through Anthropic's API (measured cost USD 17.704, Section 3.2) and one of the two meaning-preservation judges (measured cost USD 7.021 for the Claude Opus 5 judge, Section 3.5). The second judge, gpt-oss-120b, was served through Groq and its cost was not separately metered. These are arm's-length purchases of a metered service, reported in the paper as measurements of attack economics because attack cost is part of the threat model. They establish no relationship with the vendors beyond that of a paying customer, and no vendor reviewed, funded, approved or was consulted about this work.</w:t>
       </w:r>
     </w:p>
     <w:p>
       <w:pPr>
         <w:spacing w:after="120" w:line="276"/>
+        <w:ind w:left="360" w:hanging="360"/>
         <w:jc w:val="both"/>
       </w:pPr>
       <w:r>
@@ -17949,7 +17952,7 @@
         <w:t xml:space="preserve">A structural conflict inside the measurement, declared and mitigated.</w:t>
       </w:r>
       <w:r>
-        <w:t xml:space="preserve"> One    model, Claude Opus 5, occupies two roles in the design: it produces the    </w:t>
+        <w:t xml:space="preserve"> One model, Claude Opus 5, occupies two roles in the design: it produces the </w:t>
       </w:r>
       <w:r>
         <w:rPr>
@@ -17960,7 +17963,7 @@
         <w:t xml:space="preserve">launder_api</w:t>
       </w:r>
       <w:r>
-        <w:t xml:space="preserve"> texts and it serves as one of the two judges. This is a conflict    internal to the protocol rather than an interest of the author, and the    pre-registration sealed at commit </w:t>
+        <w:t xml:space="preserve"> texts and it serves as one of the two judges. This is a conflict internal to the protocol rather than an interest of the author, and the pre-registration sealed at commit </w:t>
       </w:r>
       <w:r>
         <w:rPr>
@@ -17971,7 +17974,7 @@
         <w:t xml:space="preserve">cbcb988</w:t>
       </w:r>
       <w:r>
-        <w:t xml:space="preserve"> addresses it before any verdict was    read: two judges drawn from different model families, agreement of both judges    required for any </w:t>
+        <w:t xml:space="preserve"> addresses it before any verdict was read: two judges drawn from different model families, agreement of both judges required for any </w:t>
       </w:r>
       <w:r>
         <w:rPr>
@@ -17982,7 +17985,7 @@
         <w:t xml:space="preserve">launder_api</w:t>
       </w:r>
       <w:r>
-        <w:t xml:space="preserve"> verdict, and all fluency conclusions drawn from the    independent judge only. Section 4.4 reports the one conflicted cell (Opus 5 never    preferring the original on </w:t>
+        <w:t xml:space="preserve"> verdict, and all fluency conclusions drawn from the independent judge only. Section 4.4 reports the one conflicted cell (Opus 5 never preferring the original on </w:t>
       </w:r>
       <w:r>
         <w:rPr>
@@ -17993,12 +17996,13 @@
         <w:t xml:space="preserve">launder_api</w:t>
       </w:r>
       <w:r>
-        <w:t xml:space="preserve"> pairs, 0.0%, with a 0.0% position-flip    rate) and discards rather than interprets it.</w:t>
+        <w:t xml:space="preserve"> pairs, 0.0%, with a 0.0% position-flip rate) and discards rather than interprets it.</w:t>
       </w:r>
     </w:p>
     <w:p>
       <w:pPr>
         <w:spacing w:after="120" w:line="276"/>
+        <w:ind w:left="360" w:hanging="360"/>
         <w:jc w:val="both"/>
       </w:pPr>
       <w:r>
@@ -18012,7 +18016,7 @@
         <w:t xml:space="preserve">Relationship to the evaluated toolkit.</w:t>
       </w:r>
       <w:r>
-        <w:t xml:space="preserve"> This work is a research fork of the    MarkLLM toolkit (Apache-2.0). The author is not affiliated with its developers,    did not consult them, and they did not review the manuscript. The calibration    findings concern that toolkit's shipped default configuration.</w:t>
+        <w:t xml:space="preserve"> This work is a research fork of the MarkLLM toolkit (Apache-2.0). The author is not affiliated with its developers, did not consult them, and they did not review the manuscript. The calibration findings concern that toolkit's shipped default configuration.</w:t>
       </w:r>
     </w:p>
     <w:p>

</xml_diff>